<commit_message>
updating paper with new plot
</commit_message>
<xml_diff>
--- a/10 DS 687 Capstone Progress Report - Jan McConnell.docx
+++ b/10 DS 687 Capstone Progress Report - Jan McConnell.docx
@@ -2406,6 +2406,7 @@
         </w:rPr>
         <w:t xml:space="preserve"> where the challenge is not just </w:t>
       </w:r>
+      <w:proofErr w:type="gramStart"/>
       <w:r>
         <w:rPr>
           <w:rFonts w:ascii="Verdana" w:hAnsi="Verdana"/>
@@ -2430,6 +2431,7 @@
         </w:rPr>
         <w:t xml:space="preserve"> but</w:t>
       </w:r>
+      <w:proofErr w:type="gramEnd"/>
       <w:r>
         <w:rPr>
           <w:rFonts w:ascii="Verdana" w:hAnsi="Verdana"/>
@@ -3385,7 +3387,15 @@
         <w:pStyle w:val="ISCAPBlockedParagraph"/>
       </w:pPr>
       <w:r>
-        <w:t>These perspectives frame IMDb ratings not as direct measures of audience preference but as observable signals produced through interaction between users, items, and platform structure.</w:t>
+        <w:t xml:space="preserve">These perspectives frame IMDb ratings not as direct measures of audience </w:t>
+      </w:r>
+      <w:proofErr w:type="gramStart"/>
+      <w:r>
+        <w:t>preference</w:t>
+      </w:r>
+      <w:proofErr w:type="gramEnd"/>
+      <w:r>
+        <w:t xml:space="preserve"> but as observable signals produced through interaction between users, items, and platform structure.</w:t>
       </w:r>
     </w:p>
     <w:p>
@@ -5638,9 +5648,11 @@
           <w:numId w:val="18"/>
         </w:numPr>
       </w:pPr>
+      <w:proofErr w:type="gramStart"/>
       <w:r>
         <w:t>primaryTitle</w:t>
       </w:r>
+      <w:proofErr w:type="gramEnd"/>
     </w:p>
     <w:p>
       <w:pPr>
@@ -5883,7 +5895,15 @@
         </w:numPr>
       </w:pPr>
       <w:r>
-        <w:t>Release year retained as a continuous control variable to account for temporal growth in participation.</w:t>
+        <w:t xml:space="preserve">Release year </w:t>
+      </w:r>
+      <w:proofErr w:type="gramStart"/>
+      <w:r>
+        <w:t>retained</w:t>
+      </w:r>
+      <w:proofErr w:type="gramEnd"/>
+      <w:r>
+        <w:t xml:space="preserve"> as a continuous control variable to account for temporal growth in participation.</w:t>
       </w:r>
     </w:p>
     <w:p>
@@ -6087,7 +6107,7 @@
           <w:noProof/>
         </w:rPr>
         <w:drawing>
-          <wp:inline distT="0" distB="0" distL="0" distR="0" wp14:anchorId="1614F680" wp14:editId="069FD558">
+          <wp:inline distT="0" distB="0" distL="0" distR="0" wp14:anchorId="1614F680" wp14:editId="13EAF03B">
             <wp:extent cx="2743200" cy="1297407"/>
             <wp:effectExtent l="0" t="0" r="0" b="0"/>
             <wp:docPr id="1483556017" name="Picture 1"/>
@@ -7100,9 +7120,9 @@
           <w:noProof/>
         </w:rPr>
         <w:drawing>
-          <wp:inline distT="0" distB="0" distL="0" distR="0" wp14:anchorId="7DDBBE96" wp14:editId="112C26D2">
-            <wp:extent cx="2743200" cy="2278250"/>
-            <wp:effectExtent l="0" t="0" r="0" b="8255"/>
+          <wp:inline distT="0" distB="0" distL="0" distR="0" wp14:anchorId="7DDBBE96" wp14:editId="466BFF7E">
+            <wp:extent cx="2743198" cy="2278250"/>
+            <wp:effectExtent l="0" t="0" r="635" b="8255"/>
             <wp:docPr id="1569953964" name="Picture 1"/>
             <wp:cNvGraphicFramePr>
               <a:graphicFrameLocks xmlns:a="http://schemas.openxmlformats.org/drawingml/2006/main" noChangeAspect="1"/>
@@ -7129,7 +7149,7 @@
                   <pic:spPr>
                     <a:xfrm>
                       <a:off x="0" y="0"/>
-                      <a:ext cx="2743200" cy="2278250"/>
+                      <a:ext cx="2743198" cy="2278250"/>
                     </a:xfrm>
                     <a:prstGeom prst="rect">
                       <a:avLst/>
@@ -7169,7 +7189,7 @@
         <w:pStyle w:val="ISCAPBlockedParagraph"/>
       </w:pPr>
       <w:r>
-        <w:t>Figure 9 shows the relationship between IMDb average rating and log-transformed vote counts. The figure includes reference lines for the mean rating and mean engagement level, along with both linear and quadratic trend lines to summarize the overall pattern.</w:t>
+        <w:t xml:space="preserve">Figure 9 shows the relationship between IMDb average rating and log-transformed vote counts. The figure includes reference lines for the mean rating and mean engagement level, along with linear, quadratic, and non-parametric LOWESS trend lines to summarize the overall pattern. </w:t>
       </w:r>
     </w:p>
     <w:p>
@@ -7196,20 +7216,33 @@
       </w:pPr>
       <w:r>
         <w:lastRenderedPageBreak/>
-        <w:t>The quadratic trend reveals additional structure. Engagement increases into the mid-range of ratings and then declines at higher rating levels, suggesting that participation tends to peak among broadly rated titles rather than the highest-rated ones. This pattern indicates that engagement is not a simple increasing function of rating.</w:t>
-      </w:r>
-    </w:p>
-    <w:p>
-      <w:pPr>
-        <w:pStyle w:val="ISCAPBlockedParagraph"/>
-      </w:pPr>
-    </w:p>
-    <w:p>
-      <w:pPr>
-        <w:pStyle w:val="ISCAPBlockedParagraph"/>
-      </w:pPr>
-      <w:r>
-        <w:t>Rating level and engagement volume therefore represent related but distinct signals. Average rating reflects evaluative intensity among voters, whereas vote count captures participation scale. The dispersion across the rating spectrum, together with the non-linear pattern, suggests that engagement is influenced by factors beyond rating level alone. These findings support modeling engagement volume directly and reinforce the distinction between quality perception and participation magnitude.</w:t>
+        <w:t>The quadratic trend reveals a general non-linear structure, with engagement increasing into the mid-range of ratings and declining at higher rating levels. However, the LOWESS smoother provides a more flexible, data-driven view of the relationship. It shows that the decline in engagement beyond approximately rating 7 is more pronounced than suggested by the quadratic fit. This indicates that the relationship is not symmetric and that engagement does not continue to increase at the highest rating levels.</w:t>
+      </w:r>
+    </w:p>
+    <w:p>
+      <w:pPr>
+        <w:pStyle w:val="ISCAPBlockedParagraph"/>
+      </w:pPr>
+    </w:p>
+    <w:p>
+      <w:pPr>
+        <w:pStyle w:val="ISCAPBlockedParagraph"/>
+      </w:pPr>
+      <w:r>
+        <w:t>This pattern likely reflects participation dynamics rather than evaluative quality. Titles with mid-range ratings tend to attract broader audiences and higher participation, while highly rated titles may reflect more selective or niche engagement. In addition, newer or less widely distributed titles may achieve high ratings with smaller voting populations, contributing to lower observed engagement at the upper end of the rating scale.</w:t>
+      </w:r>
+    </w:p>
+    <w:p>
+      <w:pPr>
+        <w:pStyle w:val="ISCAPBlockedParagraph"/>
+      </w:pPr>
+    </w:p>
+    <w:p>
+      <w:pPr>
+        <w:pStyle w:val="ISCAPBlockedParagraph"/>
+      </w:pPr>
+      <w:r>
+        <w:t>Rating level and engagement volume therefore represent related but distinct signals. Average rating reflects evaluative intensity among voters, whereas vote count captures participation scale. The dispersion across the rating spectrum, together with the non-linear pattern identified by both parametric and non-parametric trends, indicates that engagement is influenced by factors beyond rating level alone. These findings support modeling engagement volume directly and reinforce the distinction between quality perception and participation magnitude.</w:t>
       </w:r>
     </w:p>
     <w:p>
@@ -7330,10 +7363,7 @@
         <w:t>growth</w:t>
       </w:r>
       <w:r>
-        <w:t xml:space="preserve"> in audience participation and platform adoption. </w:t>
-      </w:r>
-      <w:r>
-        <w:t xml:space="preserve">More recent decades display lower mean engagement, </w:t>
+        <w:t xml:space="preserve"> in audience participation and platform adoption. More recent decades display lower mean engagement, </w:t>
       </w:r>
       <w:r>
         <w:t>consistent with platform recency effects rather than differences in rating level.</w:t>
@@ -7449,7 +7479,11 @@
         <w:pStyle w:val="ISCAPBlockedParagraph"/>
       </w:pPr>
       <w:r>
-        <w:t>This replication strengthens confidence that the findings reflect properties of the dataset and model specification rather than software-specific estimation behavior.</w:t>
+        <w:t xml:space="preserve">This replication strengthens confidence that the </w:t>
+      </w:r>
+      <w:r>
+        <w:lastRenderedPageBreak/>
+        <w:t>findings reflect properties of the dataset and model specification rather than software-specific estimation behavior.</w:t>
       </w:r>
     </w:p>
     <w:p>
@@ -7480,251 +7514,250 @@
         <w:pStyle w:val="ISCAPHeading"/>
       </w:pPr>
       <w:r>
+        <w:t>8. CONCLUSIONS</w:t>
+      </w:r>
+    </w:p>
+    <w:p>
+      <w:pPr>
+        <w:pStyle w:val="ISCAPBlockedParagraph"/>
+      </w:pPr>
+    </w:p>
+    <w:p>
+      <w:pPr>
+        <w:pStyle w:val="ISCAPBlockedParagraph"/>
+      </w:pPr>
+      <w:r>
+        <w:t>This study examined whether observable audience engagement signals can be extracted from large-scale IMDb rating and metadata structures. Rather than treating ratings as direct measures of quality, the analysis evaluated how engagement metrics relate to production characteristics and historical participation patterns.</w:t>
+      </w:r>
+    </w:p>
+    <w:p>
+      <w:pPr>
+        <w:pStyle w:val="ISCAPBlockedParagraph"/>
+      </w:pPr>
+    </w:p>
+    <w:p>
+      <w:pPr>
+        <w:pStyle w:val="ISCAPBlockedParagraph"/>
+      </w:pPr>
+      <w:r>
+        <w:t>The findings show that engagement on IMDb reflects multiple structural influences. Genre identity exhibits consistent associations with engagement volume, indicating stable differences in voting behavior across content categories. Production scale, represented by the number of credited contributors, is also associated with higher participation levels. In addition, participation patterns vary across historical periods, reflecting broader changes in platform adoption and audience behavior.</w:t>
+      </w:r>
+    </w:p>
+    <w:p>
+      <w:pPr>
+        <w:pStyle w:val="ISCAPBlockedParagraph"/>
+      </w:pPr>
+    </w:p>
+    <w:p>
+      <w:pPr>
+        <w:pStyle w:val="ISCAPBlockedParagraph"/>
+      </w:pPr>
+      <w:r>
+        <w:t>The results further demonstrate that rating level and vote count capture distinct dimensions of audience response. While ratings measure evaluative intensity among participants, vote counts reflect participation scale and exposure. Treating these signals separately provides a clearer interpretation of audience engagement dynamics.</w:t>
+      </w:r>
+      <w:r>
+        <w:t xml:space="preserve"> </w:t>
+      </w:r>
+      <w:r>
+        <w:t>The relationship between rating and engagement is not strictly linear, with participation peaking at mid-range ratings rather than at the highest-rated titles.</w:t>
+      </w:r>
+    </w:p>
+    <w:p>
+      <w:pPr>
+        <w:pStyle w:val="ISCAPBlockedParagraph"/>
+      </w:pPr>
+    </w:p>
+    <w:p>
+      <w:pPr>
+        <w:pStyle w:val="ISCAPBlockedParagraph"/>
+      </w:pPr>
+      <w:r>
+        <w:t>Overall, the study demonstrates that structured relational metadata can reveal interpretable engagement patterns</w:t>
+      </w:r>
+      <w:r>
+        <w:t xml:space="preserve"> through transparent statistical analysis</w:t>
+      </w:r>
+      <w:r>
+        <w:t>, even without complex predictive models. These findings highlight the value of transparent analytical frameworks for examining large media datasets while acknowledging the limitations inherent in aggregated participation data.</w:t>
+      </w:r>
+    </w:p>
+    <w:p>
+      <w:pPr>
+        <w:pStyle w:val="ISCAPBlockedParagraph"/>
+      </w:pPr>
+    </w:p>
+    <w:p>
+      <w:pPr>
+        <w:pStyle w:val="ISCAPHeading"/>
+      </w:pPr>
+      <w:r>
+        <w:t>9. FUTURE WORK</w:t>
+      </w:r>
+    </w:p>
+    <w:p>
+      <w:pPr>
+        <w:pStyle w:val="ISCAPBlockedParagraph"/>
+      </w:pPr>
+    </w:p>
+    <w:p>
+      <w:pPr>
+        <w:pStyle w:val="ISCAPSubheading"/>
+      </w:pPr>
+      <w:r>
+        <w:t xml:space="preserve">9.1 </w:t>
+      </w:r>
+      <w:r>
+        <w:t>Temporal Controls in Multivariate Models</w:t>
+      </w:r>
+    </w:p>
+    <w:p>
+      <w:pPr>
+        <w:pStyle w:val="ISCAPBlockedParagraph"/>
+      </w:pPr>
+      <w:r>
+        <w:t>The release-decade analysis demonstrates that engagement is not time-neutral. A natural extension would be to incorporate release period directly into the regression framework, either through decade indicators or continuous year controls. Including temporal controls would allow estimation of genre effects net of historical participation growth and platform adoption effects, strengthening interpretability of structural associations.</w:t>
+      </w:r>
+    </w:p>
+    <w:p>
+      <w:pPr>
+        <w:pStyle w:val="ISCAPBlockedParagraph"/>
+      </w:pPr>
+    </w:p>
+    <w:p>
+      <w:pPr>
+        <w:pStyle w:val="ISCAPSubheading"/>
+      </w:pPr>
+      <w:r>
+        <w:t xml:space="preserve">9.2 </w:t>
+      </w:r>
+      <w:r>
+        <w:t>Role-Specific Personnel Effects</w:t>
+      </w:r>
+    </w:p>
+    <w:p>
+      <w:pPr>
+        <w:pStyle w:val="ISCAPBlockedParagraph"/>
+      </w:pPr>
+      <w:r>
+        <w:t>The present analysis operationalizes production scale using total principal count. Future work could disaggregate personnel roles by category, such as actor, director, writer, or producer, to examine whether specific role types exhibit distinct associations with engagement volume. This would allow more granular interpretation of how production structure relates to audience participation.</w:t>
+      </w:r>
+    </w:p>
+    <w:p>
+      <w:pPr>
+        <w:pStyle w:val="ISCAPBlockedParagraph"/>
+        <w:rPr>
+          <w:b/>
+        </w:rPr>
+      </w:pPr>
+    </w:p>
+    <w:p>
+      <w:pPr>
+        <w:pStyle w:val="ISCAPSubheading"/>
+      </w:pPr>
+      <w:r>
+        <w:t xml:space="preserve">9.3 </w:t>
+      </w:r>
+      <w:r>
+        <w:t>Interaction Effects Between Genre and Time</w:t>
+      </w:r>
+    </w:p>
+    <w:p>
+      <w:pPr>
+        <w:pStyle w:val="ISCAPBlockedParagraph"/>
+      </w:pPr>
+      <w:r>
+        <w:t>Genre popularity may evolve across historical periods. Extending the model to include interaction terms between genre indicators and release period could clarify whether genre engagement patterns are stable or historically contingent. This would deepen understanding of how structural metadata interacts with temporal context.</w:t>
+      </w:r>
+    </w:p>
+    <w:p>
+      <w:pPr>
+        <w:pStyle w:val="ISCAPBlockedParagraph"/>
+      </w:pPr>
+    </w:p>
+    <w:p>
+      <w:pPr>
+        <w:pStyle w:val="ISCAPSubheading"/>
+      </w:pPr>
+      <w:r>
+        <w:t xml:space="preserve">9.4 </w:t>
+      </w:r>
+      <w:r>
+        <w:t>Distributional Modeling Beyond OLS</w:t>
+      </w:r>
+    </w:p>
+    <w:p>
+      <w:pPr>
+        <w:pStyle w:val="ISCAPBlockedParagraph"/>
+      </w:pPr>
+      <w:r>
+        <w:t>Although log transformation improves adherence to linear modeling assumptions, engagement volume remains highly skewed. Future work could evaluate alternative modeling approaches, such as generalized linear models for count data or quantile regression, to assess whether structural associations differ across engagement levels.</w:t>
+      </w:r>
+    </w:p>
+    <w:p>
+      <w:pPr>
+        <w:pStyle w:val="ISCAPBlockedParagraph"/>
+      </w:pPr>
+    </w:p>
+    <w:p>
+      <w:pPr>
+        <w:pStyle w:val="ISCAPSubheading"/>
+      </w:pPr>
+      <w:r>
+        <w:t xml:space="preserve">9.5 </w:t>
+      </w:r>
+      <w:r>
+        <w:t>Incorporation of Review Text or External Signals</w:t>
+      </w:r>
+    </w:p>
+    <w:p>
+      <w:pPr>
+        <w:pStyle w:val="ISCAPBlockedParagraph"/>
+      </w:pPr>
+      <w:r>
+        <w:t>Prior literature suggests that numeric ratings capture only part of audience response. Integrating textual review data or external performance indicators could provide a richer representation of engagement and enable comparison between quantitative and qualitative signals.</w:t>
+      </w:r>
+    </w:p>
+    <w:p>
+      <w:pPr>
+        <w:pStyle w:val="ISCAPBlockedParagraph"/>
+      </w:pPr>
+    </w:p>
+    <w:p>
+      <w:pPr>
+        <w:pStyle w:val="ISCAPHeading"/>
+      </w:pPr>
+      <w:r>
+        <w:t>10. LIMITATIONS</w:t>
+      </w:r>
+    </w:p>
+    <w:p>
+      <w:pPr>
+        <w:pStyle w:val="ISCAPBlockedParagraph"/>
+      </w:pPr>
+    </w:p>
+    <w:p>
+      <w:pPr>
+        <w:pStyle w:val="ISCAPBlockedParagraph"/>
+      </w:pPr>
+      <w:r>
+        <w:t xml:space="preserve">Several limitations should be considered when interpreting the results of this study. The analysis </w:t>
+      </w:r>
+      <w:r>
         <w:lastRenderedPageBreak/>
-        <w:t>8. CONCLUSIONS</w:t>
-      </w:r>
-    </w:p>
-    <w:p>
-      <w:pPr>
-        <w:pStyle w:val="ISCAPBlockedParagraph"/>
-      </w:pPr>
-    </w:p>
-    <w:p>
-      <w:pPr>
-        <w:pStyle w:val="ISCAPBlockedParagraph"/>
-      </w:pPr>
-      <w:r>
-        <w:t>This study examined whether observable audience engagement signals can be extracted from large-scale IMDb rating and metadata structures. Rather than treating ratings as direct measures of quality, the analysis evaluated how engagement metrics relate to production characteristics and historical participation patterns.</w:t>
-      </w:r>
-    </w:p>
-    <w:p>
-      <w:pPr>
-        <w:pStyle w:val="ISCAPBlockedParagraph"/>
-      </w:pPr>
-    </w:p>
-    <w:p>
-      <w:pPr>
-        <w:pStyle w:val="ISCAPBlockedParagraph"/>
-      </w:pPr>
-      <w:r>
-        <w:t>The findings show that engagement on IMDb reflects multiple structural influences. Genre identity exhibits consistent associations with engagement volume, indicating stable differences in voting behavior across content categories. Production scale, represented by the number of credited contributors, is also associated with higher participation levels. In addition, participation patterns vary across historical periods, reflecting broader changes in platform adoption and audience behavior.</w:t>
-      </w:r>
-    </w:p>
-    <w:p>
-      <w:pPr>
-        <w:pStyle w:val="ISCAPBlockedParagraph"/>
-      </w:pPr>
-    </w:p>
-    <w:p>
-      <w:pPr>
-        <w:pStyle w:val="ISCAPBlockedParagraph"/>
-      </w:pPr>
-      <w:r>
-        <w:t>The results further demonstrate that rating level and vote count capture distinct dimensions of audience response. While ratings measure evaluative intensity among participants, vote counts reflect participation scale and exposure. Treating these signals separately provides a clearer interpretation of audience engagement dynamics.</w:t>
-      </w:r>
-      <w:r>
-        <w:t xml:space="preserve"> </w:t>
-      </w:r>
-      <w:r>
-        <w:t>The relationship between rating and engagement is not strictly linear, with participation peaking at mid-range ratings rather than at the highest-rated titles.</w:t>
-      </w:r>
-    </w:p>
-    <w:p>
-      <w:pPr>
-        <w:pStyle w:val="ISCAPBlockedParagraph"/>
-      </w:pPr>
-    </w:p>
-    <w:p>
-      <w:pPr>
-        <w:pStyle w:val="ISCAPBlockedParagraph"/>
-      </w:pPr>
-      <w:r>
-        <w:t>Overall, the study demonstrates that structured relational metadata can reveal interpretable engagement patterns</w:t>
-      </w:r>
-      <w:r>
-        <w:t xml:space="preserve"> through transparent statistical analysis</w:t>
-      </w:r>
-      <w:r>
-        <w:t>, even without complex predictive models. These findings highlight the value of transparent analytical frameworks for examining large media datasets while acknowledging the limitations inherent in aggregated participation data.</w:t>
-      </w:r>
-    </w:p>
-    <w:p>
-      <w:pPr>
-        <w:pStyle w:val="ISCAPBlockedParagraph"/>
-      </w:pPr>
-    </w:p>
-    <w:p>
-      <w:pPr>
-        <w:pStyle w:val="ISCAPHeading"/>
-      </w:pPr>
-      <w:r>
-        <w:t>9. FUTURE WORK</w:t>
-      </w:r>
-    </w:p>
-    <w:p>
-      <w:pPr>
-        <w:pStyle w:val="ISCAPBlockedParagraph"/>
-      </w:pPr>
-    </w:p>
-    <w:p>
-      <w:pPr>
-        <w:pStyle w:val="ISCAPSubheading"/>
-      </w:pPr>
-      <w:r>
-        <w:t xml:space="preserve">9.1 </w:t>
-      </w:r>
-      <w:r>
-        <w:t>Temporal Controls in Multivariate Models</w:t>
-      </w:r>
-    </w:p>
-    <w:p>
-      <w:pPr>
-        <w:pStyle w:val="ISCAPBlockedParagraph"/>
-      </w:pPr>
-      <w:r>
-        <w:t>The release-decade analysis demonstrates that engagement is not time-neutral. A natural extension would be to incorporate release period directly into the regression framework, either through decade indicators or continuous year controls. Including temporal controls would allow estimation of genre effects net of historical participation growth and platform adoption effects, strengthening interpretability of structural associations.</w:t>
-      </w:r>
-    </w:p>
-    <w:p>
-      <w:pPr>
-        <w:pStyle w:val="ISCAPBlockedParagraph"/>
-      </w:pPr>
-    </w:p>
-    <w:p>
-      <w:pPr>
-        <w:pStyle w:val="ISCAPSubheading"/>
-      </w:pPr>
-      <w:r>
-        <w:t xml:space="preserve">9.2 </w:t>
-      </w:r>
-      <w:r>
-        <w:t>Role-Specific Personnel Effects</w:t>
-      </w:r>
-    </w:p>
-    <w:p>
-      <w:pPr>
-        <w:pStyle w:val="ISCAPBlockedParagraph"/>
-      </w:pPr>
-      <w:r>
-        <w:t>The present analysis operationalizes production scale using total principal count. Future work could disaggregate personnel roles by category, such as actor, director, writer, or producer, to examine whether specific role types exhibit distinct associations with engagement volume. This would allow more granular interpretation of how production structure relates to audience participation.</w:t>
-      </w:r>
-    </w:p>
-    <w:p>
-      <w:pPr>
-        <w:pStyle w:val="ISCAPBlockedParagraph"/>
-        <w:rPr>
-          <w:b/>
-        </w:rPr>
-      </w:pPr>
-    </w:p>
-    <w:p>
-      <w:pPr>
-        <w:pStyle w:val="ISCAPSubheading"/>
-      </w:pPr>
-      <w:r>
-        <w:t xml:space="preserve">9.3 </w:t>
-      </w:r>
-      <w:r>
-        <w:t>Interaction Effects Between Genre and Time</w:t>
-      </w:r>
-    </w:p>
-    <w:p>
-      <w:pPr>
-        <w:pStyle w:val="ISCAPBlockedParagraph"/>
-      </w:pPr>
-      <w:r>
-        <w:t>Genre popularity may evolve across historical periods. Extending the model to include interaction terms between genre indicators and release period could clarify whether genre engagement patterns are stable or historically contingent. This would deepen understanding of how structural metadata interacts with temporal context.</w:t>
-      </w:r>
-    </w:p>
-    <w:p>
-      <w:pPr>
-        <w:pStyle w:val="ISCAPBlockedParagraph"/>
-      </w:pPr>
-    </w:p>
-    <w:p>
-      <w:pPr>
-        <w:pStyle w:val="ISCAPSubheading"/>
-      </w:pPr>
-      <w:r>
-        <w:t xml:space="preserve">9.4 </w:t>
-      </w:r>
-      <w:r>
-        <w:t>Distributional Modeling Beyond OLS</w:t>
-      </w:r>
-    </w:p>
-    <w:p>
-      <w:pPr>
-        <w:pStyle w:val="ISCAPBlockedParagraph"/>
-      </w:pPr>
-      <w:r>
-        <w:t>Although log transformation improves adherence to linear modeling assumptions, engagement volume remains highly skewed. Future work could evaluate alternative modeling approaches, such as generalized linear models for count data or quantile regression, to assess whether structural associations differ across engagement levels.</w:t>
-      </w:r>
-    </w:p>
-    <w:p>
-      <w:pPr>
-        <w:pStyle w:val="ISCAPBlockedParagraph"/>
-      </w:pPr>
-    </w:p>
-    <w:p>
-      <w:pPr>
-        <w:pStyle w:val="ISCAPSubheading"/>
-      </w:pPr>
-      <w:r>
-        <w:t xml:space="preserve">9.5 </w:t>
-      </w:r>
-      <w:r>
-        <w:t>Incorporation of Review Text or External Signals</w:t>
-      </w:r>
-    </w:p>
-    <w:p>
-      <w:pPr>
-        <w:pStyle w:val="ISCAPBlockedParagraph"/>
-      </w:pPr>
-      <w:r>
-        <w:t>Prior literature suggests that numeric ratings capture only part of audience response. Integrating textual review data or external performance indicators could provide a richer representation of engagement and enable comparison between quantitative and qualitative signals.</w:t>
-      </w:r>
-    </w:p>
-    <w:p>
-      <w:pPr>
-        <w:pStyle w:val="ISCAPBlockedParagraph"/>
-      </w:pPr>
-    </w:p>
-    <w:p>
-      <w:pPr>
-        <w:pStyle w:val="ISCAPHeading"/>
-      </w:pPr>
-      <w:r>
-        <w:t>10. LIMITATIONS</w:t>
-      </w:r>
-    </w:p>
-    <w:p>
-      <w:pPr>
-        <w:pStyle w:val="ISCAPBlockedParagraph"/>
-      </w:pPr>
-    </w:p>
-    <w:p>
-      <w:pPr>
-        <w:pStyle w:val="ISCAPBlockedParagraph"/>
-      </w:pPr>
-      <w:r>
-        <w:t>Several limitations should be considered when interpreting the results of this study. The analysis relies on aggregated engagement metrics and observable metadata from the IMDb public dataset. As a result, the models capture structural associations rather than causal relationships between production characteristics and audience participation.</w:t>
-      </w:r>
-    </w:p>
-    <w:p>
-      <w:pPr>
-        <w:pStyle w:val="ISCAPBlockedParagraph"/>
-      </w:pPr>
-    </w:p>
-    <w:p>
-      <w:pPr>
-        <w:pStyle w:val="ISCAPBlockedParagraph"/>
-      </w:pPr>
-      <w:r>
-        <w:t xml:space="preserve">The regression framework also incorporates a limited set of explanatory variables. Important factors such as marketing exposure, distribution scale, production budget, and platform promotion are not available in the dataset and therefore cannot be included in the model. These unobserved influences likely contribute to the </w:t>
-      </w:r>
-      <w:r>
-        <w:lastRenderedPageBreak/>
-        <w:t>unexplained variance in engagement outcomes.</w:t>
+        <w:t>relies on aggregated engagement metrics and observable metadata from the IMDb public dataset. As a result, the models capture structural associations rather than causal relationships between production characteristics and audience participation.</w:t>
+      </w:r>
+    </w:p>
+    <w:p>
+      <w:pPr>
+        <w:pStyle w:val="ISCAPBlockedParagraph"/>
+      </w:pPr>
+    </w:p>
+    <w:p>
+      <w:pPr>
+        <w:pStyle w:val="ISCAPBlockedParagraph"/>
+      </w:pPr>
+      <w:r>
+        <w:t>The regression framework also incorporates a limited set of explanatory variables. Important factors such as marketing exposure, distribution scale, production budget, and platform promotion are not available in the dataset and therefore cannot be included in the model. These unobserved influences likely contribute to the unexplained variance in engagement outcomes.</w:t>
       </w:r>
     </w:p>
     <w:p>
@@ -8284,13 +8317,7 @@
         <w:rPr>
           <w:b w:val="0"/>
         </w:rPr>
-        <w:t xml:space="preserve">This paper is a useful example of how rating data can be treated as more than a single summary measure. The work illustrates an alternative way of organizing rating information that makes it easier to reason about how different item characteristics may influence audience </w:t>
-      </w:r>
-      <w:r>
-        <w:rPr>
-          <w:b w:val="0"/>
-        </w:rPr>
-        <w:t>responses.</w:t>
+        <w:t>This paper is a useful example of how rating data can be treated as more than a single summary measure. The work illustrates an alternative way of organizing rating information that makes it easier to reason about how different item characteristics may influence audience responses.</w:t>
       </w:r>
     </w:p>
     <w:p>
@@ -8678,7 +8705,11 @@
         <w:pStyle w:val="ISCAPBlockedParagraph"/>
       </w:pPr>
       <w:r>
-        <w:t>This paper proposes a multidimensional framework that integrates relational data warehouses and Online Analytical Processing (OLAP) with recommender systems. It details a three-tier architecture, Source, Warehouse, and OLAP, that allows analysts to perform ad-hoc queries, such as drill-downs and slice/dice operations, to evaluate performance against business objectives.</w:t>
+        <w:t xml:space="preserve">This paper proposes a multidimensional framework that integrates relational data warehouses and Online Analytical Processing (OLAP) with recommender systems. It details a three-tier architecture, Source, Warehouse, and </w:t>
+      </w:r>
+      <w:r>
+        <w:lastRenderedPageBreak/>
+        <w:t>OLAP, that allows analysts to perform ad-hoc queries, such as drill-downs and slice/dice operations, to evaluate performance against business objectives.</w:t>
       </w:r>
     </w:p>
     <w:p>
@@ -8712,7 +8743,6 @@
         <w:pStyle w:val="ISCAPSubheading"/>
       </w:pPr>
       <w:r>
-        <w:lastRenderedPageBreak/>
         <w:t xml:space="preserve">Reference </w:t>
       </w:r>
       <w:r>
@@ -9174,7 +9204,10 @@
         <w:pStyle w:val="ISCAPBlockedParagraph"/>
       </w:pPr>
       <w:r>
-        <w:t>This paper informs the project’s framing of audience engagement signals by illustrating how different forms of user feedback represent distinct dimensions of engagement. While IMDb does not provide clickstream data, the distinction between participation volume (vote counts) and evaluation intensity (average ratings) supports treating these measures as related but non-equivalent signals.</w:t>
+        <w:t xml:space="preserve">This paper informs the project’s framing of audience engagement signals by illustrating how different forms of user feedback represent distinct dimensions of engagement. While IMDb does not </w:t>
+      </w:r>
+      <w:r>
+        <w:t>provide clickstream data, the distinction between participation volume (vote counts) and evaluation intensity (average ratings) supports treating these measures as related but non-equivalent signals.</w:t>
       </w:r>
     </w:p>
     <w:p>
@@ -9319,17 +9352,7 @@
               <w:sz w:val="18"/>
               <w:szCs w:val="18"/>
             </w:rPr>
-            <w:t xml:space="preserve">the 10th ACM Conference on </w:t>
-          </w:r>
-          <w:r>
-            <w:rPr>
-              <w:rFonts w:ascii="Verdana" w:hAnsi="Verdana"/>
-              <w:i/>
-              <w:iCs/>
-              <w:sz w:val="18"/>
-              <w:szCs w:val="18"/>
-            </w:rPr>
-            <w:t>Recommender Systems</w:t>
+            <w:t>the 10th ACM Conference on Recommender Systems</w:t>
           </w:r>
           <w:r>
             <w:rPr>
@@ -9701,7 +9724,15 @@
         </w:sdtContent>
       </w:sdt>
       <w:r>
-        <w:t xml:space="preserve"> through models like LDA </w:t>
+        <w:t xml:space="preserve"> through models like </w:t>
+      </w:r>
+      <w:proofErr w:type="spellStart"/>
+      <w:r>
+        <w:t>LDA</w:t>
+      </w:r>
+      <w:proofErr w:type="spellEnd"/>
+      <w:r>
+        <w:t xml:space="preserve"> </w:t>
       </w:r>
       <w:r>
         <w:t>(Latent Dirichlet Allocation</w:t>
@@ -9895,6 +9926,7 @@
               <w:sz w:val="18"/>
               <w:szCs w:val="18"/>
             </w:rPr>
+            <w:lastRenderedPageBreak/>
             <w:t xml:space="preserve">220. </w:t>
           </w:r>
           <w:hyperlink r:id="rId26" w:tgtFrame="_new" w:history="1">
@@ -9942,7 +9974,6 @@
         <w:pStyle w:val="ISCAPBlockedParagraph"/>
       </w:pPr>
       <w:r>
-        <w:lastRenderedPageBreak/>
         <w:t>Value</w:t>
       </w:r>
     </w:p>
@@ -10394,7 +10425,25 @@
               <w:sz w:val="18"/>
               <w:szCs w:val="18"/>
             </w:rPr>
-            <w:t>Weinsberg, U., Bhagat, S., Ioannidis, S., &amp; Taft, N. (2012). BlurMe:</w:t>
+            <w:t xml:space="preserve">Weinsberg, U., Bhagat, S., Ioannidis, S., &amp; Taft, N. (2012). </w:t>
+          </w:r>
+          <w:proofErr w:type="spellStart"/>
+          <w:r>
+            <w:rPr>
+              <w:rFonts w:ascii="Verdana" w:hAnsi="Verdana"/>
+              <w:sz w:val="18"/>
+              <w:szCs w:val="18"/>
+            </w:rPr>
+            <w:t>BlurMe</w:t>
+          </w:r>
+          <w:proofErr w:type="spellEnd"/>
+          <w:r>
+            <w:rPr>
+              <w:rFonts w:ascii="Verdana" w:hAnsi="Verdana"/>
+              <w:sz w:val="18"/>
+              <w:szCs w:val="18"/>
+            </w:rPr>
+            <w:t>:</w:t>
           </w:r>
         </w:sdtContent>
       </w:sdt>
@@ -10752,8 +10801,9 @@
               <w:sz w:val="18"/>
               <w:szCs w:val="18"/>
             </w:rPr>
-            <w:t xml:space="preserve">Proceedings of the 25th International </w:t>
-          </w:r>
+            <w:t xml:space="preserve">Proceedings of the 25th International Conference Companion on </w:t>
+          </w:r>
+          <w:proofErr w:type="gramStart"/>
           <w:r>
             <w:rPr>
               <w:rFonts w:ascii="Verdana" w:hAnsi="Verdana"/>
@@ -10762,8 +10812,9 @@
               <w:sz w:val="18"/>
               <w:szCs w:val="18"/>
             </w:rPr>
-            <w:t>Conference Companion on World Wide</w:t>
-          </w:r>
+            <w:t>World Wide</w:t>
+          </w:r>
+          <w:proofErr w:type="gramEnd"/>
         </w:sdtContent>
       </w:sdt>
       <w:r>
@@ -10933,7 +10984,25 @@
               <w:sz w:val="18"/>
               <w:szCs w:val="18"/>
             </w:rPr>
-            <w:t>Zhao, X., Zhu, Z., Zhang, Y., &amp; Caverlee, J. (2020). Improving the</w:t>
+            <w:t xml:space="preserve">Zhao, X., Zhu, Z., Zhang, Y., &amp; </w:t>
+          </w:r>
+          <w:proofErr w:type="spellStart"/>
+          <w:r>
+            <w:rPr>
+              <w:rFonts w:ascii="Verdana" w:hAnsi="Verdana"/>
+              <w:sz w:val="18"/>
+              <w:szCs w:val="18"/>
+            </w:rPr>
+            <w:t>Caverlee</w:t>
+          </w:r>
+          <w:proofErr w:type="spellEnd"/>
+          <w:r>
+            <w:rPr>
+              <w:rFonts w:ascii="Verdana" w:hAnsi="Verdana"/>
+              <w:sz w:val="18"/>
+              <w:szCs w:val="18"/>
+            </w:rPr>
+            <w:t>, J. (2020). Improving the</w:t>
           </w:r>
         </w:sdtContent>
       </w:sdt>
@@ -15014,7 +15083,6 @@
   <w:style w:type="character" w:default="1" w:styleId="DefaultParagraphFont">
     <w:name w:val="Default Paragraph Font"/>
     <w:uiPriority w:val="1"/>
-    <w:semiHidden/>
     <w:unhideWhenUsed/>
   </w:style>
   <w:style w:type="table" w:default="1" w:styleId="TableNormal">
@@ -16006,6 +16074,7 @@
     <w:rsid w:val="001D602B"/>
     <w:rsid w:val="001E545F"/>
     <w:rsid w:val="001F4A1B"/>
+    <w:rsid w:val="002258C6"/>
     <w:rsid w:val="00244E28"/>
     <w:rsid w:val="0027333E"/>
     <w:rsid w:val="002A16ED"/>
@@ -16013,6 +16082,7 @@
     <w:rsid w:val="00365848"/>
     <w:rsid w:val="00375BF2"/>
     <w:rsid w:val="003D0A4E"/>
+    <w:rsid w:val="003D5983"/>
     <w:rsid w:val="003D73A0"/>
     <w:rsid w:val="004655FF"/>
     <w:rsid w:val="00471DA9"/>

</xml_diff>